<commit_message>
Enhance file with new feature extraction functions for price and news data, and update installation requirements. Modify new Pipeline Overview.docx to clarify model training details and optimization strategies.
</commit_message>
<xml_diff>
--- a/new Pipeline Overview.docx
+++ b/new Pipeline Overview.docx
@@ -173,6 +173,9 @@
         <w:br/>
       </w:r>
       <w:r>
+        <w:rPr>
+          <w:noProof/>
+        </w:rPr>
         <w:drawing>
           <wp:inline distT="0" distB="0" distL="0" distR="0" wp14:anchorId="2C895722" wp14:editId="26F3F477">
             <wp:extent cx="5731510" cy="2717800"/>
@@ -328,15 +331,10 @@
         <w:br/>
       </w:r>
       <w:r>
-        <w:t xml:space="preserve">prediction target y is a 3-class classification problem: </w:t>
-      </w:r>
-      <w:proofErr w:type="gramStart"/>
-      <w:r>
-        <w:t>BUY ,</w:t>
-      </w:r>
-      <w:proofErr w:type="gramEnd"/>
-      <w:r>
-        <w:t xml:space="preserve"> SELL or HOLD </w:t>
+        <w:t xml:space="preserve">1. </w:t>
+      </w:r>
+      <w:r>
+        <w:t xml:space="preserve">prediction target y is a 3-class classification problem: BUY, SELL or HOLD </w:t>
       </w:r>
     </w:p>
     <w:p>
@@ -347,6 +345,9 @@
     <w:p/>
     <w:p>
       <w:r>
+        <w:t xml:space="preserve">2. </w:t>
+      </w:r>
+      <w:r>
         <w:t>LSTM should be trained like this:</w:t>
       </w:r>
     </w:p>
@@ -365,13 +366,70 @@
     </w:p>
     <w:p>
       <w:r>
-        <w:t xml:space="preserve">Loss function: Sparse categorical cross entropy with class weights (based on class </w:t>
-      </w:r>
-      <w:proofErr w:type="gramStart"/>
-      <w:r>
-        <w:t>imbalance )</w:t>
-      </w:r>
-      <w:proofErr w:type="gramEnd"/>
+        <w:t>Loss function: Sparse categorical cross entropy with class weights (based on class imbalance)</w:t>
+      </w:r>
+    </w:p>
+    <w:p/>
+    <w:p>
+      <w:r>
+        <w:t>3. Yes, there is one field called news in the dataset with name “news”, and it is one news per row</w:t>
+      </w:r>
+      <w:r>
+        <w:t>.</w:t>
+      </w:r>
+    </w:p>
+    <w:p/>
+    <w:p>
+      <w:r>
+        <w:t xml:space="preserve">4. </w:t>
+      </w:r>
+      <w:r>
+        <w:t xml:space="preserve">Load optimizer state </w:t>
+      </w:r>
+      <w:r>
+        <w:t xml:space="preserve">+ model </w:t>
+      </w:r>
+      <w:r>
+        <w:t xml:space="preserve">weights </w:t>
+      </w:r>
+      <w:r>
+        <w:t>for the sliding window strategy</w:t>
+      </w:r>
+      <w:r>
+        <w:t xml:space="preserve"> and </w:t>
+      </w:r>
+      <w:r>
+        <w:t xml:space="preserve">Load only weights for the </w:t>
+      </w:r>
+      <w:proofErr w:type="spellStart"/>
+      <w:r>
+        <w:t>TimeSeriesSplit</w:t>
+      </w:r>
+      <w:proofErr w:type="spellEnd"/>
+      <w:r>
+        <w:t xml:space="preserve"> strategy</w:t>
+      </w:r>
+      <w:r>
+        <w:br/>
+      </w:r>
+      <w:r>
+        <w:t>Use a fixed epoch count of 3 with a learning rate</w:t>
+      </w:r>
+      <w:r>
+        <w:t xml:space="preserve"> </w:t>
+      </w:r>
+      <w:r>
+        <w:t>that is 5–10 times smaller than your original training learning rate, no early stopping for daily incremental updates</w:t>
+      </w:r>
+    </w:p>
+    <w:p/>
+    <w:p>
+      <w:r>
+        <w:t xml:space="preserve">5. </w:t>
+      </w:r>
+      <w:r>
+        <w:t>only keep the “best” checkpoint per strategy</w:t>
+      </w:r>
     </w:p>
     <w:p/>
     <w:p/>
@@ -988,7 +1046,6 @@
   <w:style w:type="character" w:default="1" w:styleId="DefaultParagraphFont">
     <w:name w:val="Default Paragraph Font"/>
     <w:uiPriority w:val="1"/>
-    <w:semiHidden/>
     <w:unhideWhenUsed/>
   </w:style>
   <w:style w:type="table" w:default="1" w:styleId="TableNormal">

</xml_diff>

<commit_message>
Changes to be committed: 	new file:   FinBERT-Download.py 	modified:   dataset.ipynb 	modified:   new Pipeline Overview.docx 	deleted:    ~$w Pipeline Overview.docx 	deleted:    ~WRL0958.tmp
</commit_message>
<xml_diff>
--- a/new Pipeline Overview.docx
+++ b/new Pipeline Overview.docx
@@ -313,10 +313,10 @@
       <w:r>
         <w:t>4) Compare both on the held-out test set (Feb 14 – Mar 24) using all metrics above</w:t>
       </w:r>
-    </w:p>
-    <w:p/>
-    <w:p/>
-    <w:p/>
+      <w:r>
+        <w:br/>
+      </w:r>
+    </w:p>
     <w:p>
       <w:r>
         <w:br w:type="page"/>
@@ -325,110 +325,95 @@
     <w:p>
       <w:r>
         <w:lastRenderedPageBreak/>
-        <w:t>Prompt to cursor:</w:t>
-      </w:r>
-      <w:r>
-        <w:br/>
-      </w:r>
-      <w:r>
-        <w:t xml:space="preserve">1. </w:t>
-      </w:r>
-      <w:r>
-        <w:t xml:space="preserve">prediction target y is a 3-class classification problem: BUY, SELL or HOLD </w:t>
-      </w:r>
-    </w:p>
-    <w:p>
-      <w:r>
-        <w:t>(Position mapping: BUY -&gt; long, HOLD -&gt; flat, SELL -&gt; short)</w:t>
-      </w:r>
-    </w:p>
-    <w:p/>
-    <w:p>
-      <w:r>
-        <w:t xml:space="preserve">2. </w:t>
-      </w:r>
-      <w:r>
-        <w:t>LSTM should be trained like this:</w:t>
-      </w:r>
-    </w:p>
-    <w:p>
-      <w:r>
-        <w:t xml:space="preserve">Output layer: </w:t>
-      </w:r>
+        <w:t>Sliding Window Pipeline:</w:t>
+      </w:r>
+    </w:p>
+    <w:p>
+      <w:r>
+        <w:drawing>
+          <wp:inline distT="0" distB="0" distL="0" distR="0" wp14:anchorId="0A01791D" wp14:editId="06D53257">
+            <wp:extent cx="2887550" cy="2217420"/>
+            <wp:effectExtent l="0" t="0" r="8255" b="0"/>
+            <wp:docPr id="2071100756" name="Picture 1"/>
+            <wp:cNvGraphicFramePr>
+              <a:graphicFrameLocks xmlns:a="http://schemas.openxmlformats.org/drawingml/2006/main" noChangeAspect="1"/>
+            </wp:cNvGraphicFramePr>
+            <a:graphic xmlns:a="http://schemas.openxmlformats.org/drawingml/2006/main">
+              <a:graphicData uri="http://schemas.openxmlformats.org/drawingml/2006/picture">
+                <pic:pic xmlns:pic="http://schemas.openxmlformats.org/drawingml/2006/picture">
+                  <pic:nvPicPr>
+                    <pic:cNvPr id="2071100756" name=""/>
+                    <pic:cNvPicPr/>
+                  </pic:nvPicPr>
+                  <pic:blipFill>
+                    <a:blip r:embed="rId5"/>
+                    <a:stretch>
+                      <a:fillRect/>
+                    </a:stretch>
+                  </pic:blipFill>
+                  <pic:spPr>
+                    <a:xfrm>
+                      <a:off x="0" y="0"/>
+                      <a:ext cx="2890832" cy="2219941"/>
+                    </a:xfrm>
+                    <a:prstGeom prst="rect">
+                      <a:avLst/>
+                    </a:prstGeom>
+                  </pic:spPr>
+                </pic:pic>
+              </a:graphicData>
+            </a:graphic>
+          </wp:inline>
+        </w:drawing>
+      </w:r>
+    </w:p>
+    <w:p>
       <w:proofErr w:type="spellStart"/>
       <w:r>
-        <w:t>Softmax</w:t>
+        <w:t>TimeSeriesSplit</w:t>
       </w:r>
       <w:proofErr w:type="spellEnd"/>
       <w:r>
-        <w:t xml:space="preserve"> with 3 units (SELL, HOLD, BUY)</w:t>
-      </w:r>
-    </w:p>
-    <w:p>
-      <w:r>
-        <w:t>Loss function: Sparse categorical cross entropy with class weights (based on class imbalance)</w:t>
-      </w:r>
-    </w:p>
-    <w:p/>
-    <w:p>
-      <w:r>
-        <w:t>3. Yes, there is one field called news in the dataset with name “news”, and it is one news per row</w:t>
-      </w:r>
-      <w:r>
-        <w:t>.</w:t>
-      </w:r>
-    </w:p>
-    <w:p/>
-    <w:p>
-      <w:r>
-        <w:t xml:space="preserve">4. </w:t>
-      </w:r>
-      <w:r>
-        <w:t xml:space="preserve">Load optimizer state </w:t>
-      </w:r>
-      <w:r>
-        <w:t xml:space="preserve">+ model </w:t>
-      </w:r>
-      <w:r>
-        <w:t xml:space="preserve">weights </w:t>
-      </w:r>
-      <w:r>
-        <w:t>for the sliding window strategy</w:t>
-      </w:r>
-      <w:r>
-        <w:t xml:space="preserve"> and </w:t>
-      </w:r>
-      <w:r>
-        <w:t xml:space="preserve">Load only weights for the </w:t>
-      </w:r>
-      <w:proofErr w:type="spellStart"/>
-      <w:r>
-        <w:t>TimeSeriesSplit</w:t>
-      </w:r>
-      <w:proofErr w:type="spellEnd"/>
-      <w:r>
-        <w:t xml:space="preserve"> strategy</w:t>
-      </w:r>
-      <w:r>
-        <w:br/>
-      </w:r>
-      <w:r>
-        <w:t>Use a fixed epoch count of 3 with a learning rate</w:t>
-      </w:r>
-      <w:r>
-        <w:t xml:space="preserve"> </w:t>
-      </w:r>
-      <w:r>
-        <w:t>that is 5–10 times smaller than your original training learning rate, no early stopping for daily incremental updates</w:t>
-      </w:r>
-    </w:p>
-    <w:p/>
-    <w:p>
-      <w:r>
-        <w:t xml:space="preserve">5. </w:t>
-      </w:r>
-      <w:r>
-        <w:t>only keep the “best” checkpoint per strategy</w:t>
+        <w:t xml:space="preserve"> Pipeline</w:t>
+      </w:r>
+    </w:p>
+    <w:p>
+      <w:r>
+        <w:drawing>
+          <wp:inline distT="0" distB="0" distL="0" distR="0" wp14:anchorId="42FC3D2B" wp14:editId="2A462D9B">
+            <wp:extent cx="2864298" cy="2415540"/>
+            <wp:effectExtent l="0" t="0" r="0" b="3810"/>
+            <wp:docPr id="520012210" name="Picture 1"/>
+            <wp:cNvGraphicFramePr>
+              <a:graphicFrameLocks xmlns:a="http://schemas.openxmlformats.org/drawingml/2006/main" noChangeAspect="1"/>
+            </wp:cNvGraphicFramePr>
+            <a:graphic xmlns:a="http://schemas.openxmlformats.org/drawingml/2006/main">
+              <a:graphicData uri="http://schemas.openxmlformats.org/drawingml/2006/picture">
+                <pic:pic xmlns:pic="http://schemas.openxmlformats.org/drawingml/2006/picture">
+                  <pic:nvPicPr>
+                    <pic:cNvPr id="520012210" name=""/>
+                    <pic:cNvPicPr/>
+                  </pic:nvPicPr>
+                  <pic:blipFill>
+                    <a:blip r:embed="rId6"/>
+                    <a:stretch>
+                      <a:fillRect/>
+                    </a:stretch>
+                  </pic:blipFill>
+                  <pic:spPr>
+                    <a:xfrm>
+                      <a:off x="0" y="0"/>
+                      <a:ext cx="2877470" cy="2426648"/>
+                    </a:xfrm>
+                    <a:prstGeom prst="rect">
+                      <a:avLst/>
+                    </a:prstGeom>
+                  </pic:spPr>
+                </pic:pic>
+              </a:graphicData>
+            </a:graphic>
+          </wp:inline>
+        </w:drawing>
       </w:r>
     </w:p>
     <w:p/>

</xml_diff>